<commit_message>
Rebuild EPA/PBA assessments from new DOCX forms and add Staff history
</commit_message>
<xml_diff>
--- a/EPA/EPA2-acute abdomen.docx
+++ b/EPA/EPA2-acute abdomen.docx
@@ -2,88 +2,26 @@
 <file path=word/document.xml><?xml version="1.0" encoding="utf-8"?>
 <w:document xmlns:wpc="http://schemas.microsoft.com/office/word/2010/wordprocessingCanvas" xmlns:cx="http://schemas.microsoft.com/office/drawing/2014/chartex" xmlns:cx1="http://schemas.microsoft.com/office/drawing/2015/9/8/chartex" xmlns:cx2="http://schemas.microsoft.com/office/drawing/2015/10/21/chartex" xmlns:cx3="http://schemas.microsoft.com/office/drawing/2016/5/9/chartex" xmlns:cx4="http://schemas.microsoft.com/office/drawing/2016/5/10/chartex" xmlns:cx5="http://schemas.microsoft.com/office/drawing/2016/5/11/chartex" xmlns:cx6="http://schemas.microsoft.com/office/drawing/2016/5/12/chartex" xmlns:cx7="http://schemas.microsoft.com/office/drawing/2016/5/13/chartex" xmlns:cx8="http://schemas.microsoft.com/office/drawing/2016/5/14/chartex" xmlns:mc="http://schemas.openxmlformats.org/markup-compatibility/2006" xmlns:aink="http://schemas.microsoft.com/office/drawing/2016/ink" xmlns:am3d="http://schemas.microsoft.com/office/drawing/2017/model3d" xmlns:o="urn:schemas-microsoft-com:office:office" xmlns:r="http://schemas.openxmlformats.org/officeDocument/2006/relationships" xmlns:m="http://schemas.openxmlformats.org/officeDocument/2006/math" xmlns:v="urn:schemas-microsoft-com:vml" xmlns:wp14="http://schemas.microsoft.com/office/word/2010/wordprocessingDrawing" xmlns:wp="http://schemas.openxmlformats.org/drawingml/2006/wordprocessingDrawing" xmlns:w10="urn:schemas-microsoft-com:office:word" xmlns:w="http://schemas.openxmlformats.org/wordprocessingml/2006/main" xmlns:w14="http://schemas.microsoft.com/office/word/2010/wordml" xmlns:w15="http://schemas.microsoft.com/office/word/2012/wordml" xmlns:w16cid="http://schemas.microsoft.com/office/word/2016/wordml/cid" xmlns:w16se="http://schemas.microsoft.com/office/word/2015/wordml/symex" xmlns:wpg="http://schemas.microsoft.com/office/word/2010/wordprocessingGroup" xmlns:wpi="http://schemas.microsoft.com/office/word/2010/wordprocessingInk" xmlns:wne="http://schemas.microsoft.com/office/word/2006/wordml" xmlns:wps="http://schemas.microsoft.com/office/word/2010/wordprocessingShape" mc:Ignorable="w14 w15 w16se w16cid wp14">
   <w:body>
-    <w:p>
-      <w:r>
-        <w:rPr>
-          <w:rFonts w:ascii="TH Sarabun New" w:hAnsi="TH Sarabun New" w:cs="TH Sarabun New"/>
-          <w:b/>
-          <w:bCs/>
-          <w:sz w:val="28"/>
-        </w:rPr>
-        <w:t>EPA</w:t>
-      </w:r>
-      <w:r>
-        <w:rPr>
-          <w:rFonts w:ascii="TH Sarabun New" w:hAnsi="TH Sarabun New" w:cs="TH Sarabun New"/>
-          <w:b/>
-          <w:bCs/>
-          <w:sz w:val="28"/>
-          <w:cs/>
-        </w:rPr>
-        <w:t xml:space="preserve"> </w:t>
-      </w:r>
-      <w:r>
-        <w:rPr>
-          <w:rFonts w:ascii="TH Sarabun New" w:hAnsi="TH Sarabun New" w:cs="TH Sarabun New"/>
-          <w:b/>
-          <w:bCs/>
-          <w:sz w:val="28"/>
-        </w:rPr>
-        <w:t xml:space="preserve">2 </w:t>
-      </w:r>
-      <w:r>
-        <w:rPr>
-          <w:rFonts w:ascii="TH Sarabun New" w:hAnsi="TH Sarabun New" w:cs="TH Sarabun New"/>
-          <w:b/>
-          <w:bCs/>
-          <w:sz w:val="28"/>
-          <w:cs/>
-        </w:rPr>
-        <w:tab/>
-      </w:r>
-      <w:r>
-        <w:rPr>
-          <w:rFonts w:ascii="TH Sarabun New" w:hAnsi="TH Sarabun New" w:cs="TH Sarabun New"/>
-          <w:b/>
-          <w:bCs/>
-          <w:sz w:val="28"/>
-        </w:rPr>
-        <w:t>Management of acute surgical abdomen</w:t>
-      </w:r>
-      <w:r>
-        <w:rPr>
-          <w:rFonts w:ascii="TH Sarabun New" w:hAnsi="TH Sarabun New" w:cs="TH Sarabun New"/>
-          <w:b/>
-          <w:bCs/>
-          <w:color w:val="C00000"/>
-          <w:sz w:val="28"/>
-          <w:cs/>
-        </w:rPr>
-        <w:t xml:space="preserve"> </w:t>
-      </w:r>
-    </w:p>
     <w:tbl>
       <w:tblPr>
-        <w:tblW w:w="9535" w:type="dxa"/>
-        <w:tblBorders>
-          <w:top w:val="single" w:sz="4" w:space="0" w:color="auto"/>
-          <w:left w:val="single" w:sz="4" w:space="0" w:color="auto"/>
-          <w:bottom w:val="single" w:sz="4" w:space="0" w:color="auto"/>
-          <w:right w:val="single" w:sz="4" w:space="0" w:color="auto"/>
-          <w:insideH w:val="single" w:sz="4" w:space="0" w:color="auto"/>
-          <w:insideV w:val="single" w:sz="4" w:space="0" w:color="auto"/>
-        </w:tblBorders>
+        <w:tblStyle w:val="a4"/>
+        <w:tblpPr w:leftFromText="180" w:rightFromText="180" w:horzAnchor="margin" w:tblpY="401"/>
+        <w:tblW w:w="0" w:type="auto"/>
         <w:tblLook w:val="04A0" w:firstRow="1" w:lastRow="0" w:firstColumn="1" w:lastColumn="0" w:noHBand="0" w:noVBand="1"/>
       </w:tblPr>
       <w:tblGrid>
-        <w:gridCol w:w="2065"/>
-        <w:gridCol w:w="7470"/>
+        <w:gridCol w:w="704"/>
+        <w:gridCol w:w="2309"/>
       </w:tblGrid>
       <w:tr>
-        <w:tc>
-          <w:tcPr>
-            <w:tcW w:w="2065" w:type="dxa"/>
-            <w:shd w:val="clear" w:color="auto" w:fill="auto"/>
+        <w:trPr>
+          <w:trHeight w:val="419"/>
+        </w:trPr>
+        <w:tc>
+          <w:tcPr>
+            <w:tcW w:w="3013" w:type="dxa"/>
+            <w:gridSpan w:val="2"/>
+            <w:vAlign w:val="center"/>
           </w:tcPr>
           <w:p>
             <w:pPr>
@@ -104,65 +42,85 @@
                 <w:sz w:val="28"/>
                 <w:cs/>
               </w:rPr>
-              <w:t>หัวข้อที่</w:t>
-            </w:r>
-          </w:p>
-        </w:tc>
-        <w:tc>
-          <w:tcPr>
-            <w:tcW w:w="7470" w:type="dxa"/>
-            <w:shd w:val="clear" w:color="auto" w:fill="auto"/>
-          </w:tcPr>
-          <w:p>
-            <w:pPr>
-              <w:jc w:val="center"/>
-              <w:rPr>
-                <w:rFonts w:ascii="TH Sarabun New" w:hAnsi="TH Sarabun New" w:cs="TH Sarabun New"/>
+              <w:t>จำนวนครั้ง</w:t>
+            </w:r>
+            <w:r>
+              <w:rPr>
+                <w:rFonts w:ascii="TH Sarabun New" w:hAnsi="TH Sarabun New" w:cs="TH Sarabun New" w:hint="cs"/>
                 <w:b/>
                 <w:bCs/>
                 <w:sz w:val="28"/>
-              </w:rPr>
-            </w:pPr>
-            <w:r>
+                <w:cs/>
+              </w:rPr>
+              <w:t>ที่ประเมิน</w:t>
+            </w:r>
+          </w:p>
+        </w:tc>
+      </w:tr>
+      <w:tr>
+        <w:trPr>
+          <w:trHeight w:val="436"/>
+        </w:trPr>
+        <w:tc>
+          <w:tcPr>
+            <w:tcW w:w="704" w:type="dxa"/>
+            <w:vAlign w:val="center"/>
+          </w:tcPr>
+          <w:p>
+            <w:pPr>
               <w:rPr>
                 <w:rFonts w:ascii="TH Sarabun New" w:hAnsi="TH Sarabun New" w:cs="TH Sarabun New"/>
                 <w:b/>
                 <w:bCs/>
                 <w:sz w:val="28"/>
-                <w:cs/>
-              </w:rPr>
-              <w:t>รายละเอียด</w:t>
+              </w:rPr>
+            </w:pPr>
+          </w:p>
+        </w:tc>
+        <w:tc>
+          <w:tcPr>
+            <w:tcW w:w="2309" w:type="dxa"/>
+            <w:vAlign w:val="center"/>
+          </w:tcPr>
+          <w:p>
+            <w:pPr>
+              <w:rPr>
+                <w:rFonts w:ascii="TH Sarabun New" w:hAnsi="TH Sarabun New" w:cs="TH Sarabun New"/>
+                <w:b/>
+                <w:bCs/>
+                <w:sz w:val="28"/>
+              </w:rPr>
+            </w:pPr>
+            <w:r>
+              <w:rPr>
+                <w:rFonts w:ascii="TH Sarabun New" w:hAnsi="TH Sarabun New" w:cs="TH Sarabun New"/>
+                <w:b/>
+                <w:bCs/>
+                <w:sz w:val="28"/>
+                <w:cs/>
+              </w:rPr>
+              <w:t xml:space="preserve">ครั้งที่ </w:t>
+            </w:r>
+            <w:r>
+              <w:rPr>
+                <w:rFonts w:ascii="TH Sarabun New" w:hAnsi="TH Sarabun New" w:cs="TH Sarabun New"/>
+                <w:b/>
+                <w:bCs/>
+                <w:sz w:val="28"/>
+              </w:rPr>
+              <w:t>1</w:t>
             </w:r>
           </w:p>
         </w:tc>
       </w:tr>
       <w:tr>
-        <w:tc>
-          <w:tcPr>
-            <w:tcW w:w="2065" w:type="dxa"/>
-            <w:shd w:val="clear" w:color="auto" w:fill="auto"/>
-          </w:tcPr>
-          <w:p>
-            <w:pPr>
-              <w:rPr>
-                <w:rFonts w:ascii="TH Sarabun New" w:hAnsi="TH Sarabun New" w:cs="TH Sarabun New"/>
-                <w:sz w:val="28"/>
-              </w:rPr>
-            </w:pPr>
-            <w:r>
-              <w:rPr>
-                <w:rFonts w:ascii="TH Sarabun New" w:hAnsi="TH Sarabun New" w:cs="TH Sarabun New"/>
-                <w:sz w:val="28"/>
-                <w:cs/>
-              </w:rPr>
-              <w:t>1.ชื่อเรื่องกิจกรรม</w:t>
-            </w:r>
-          </w:p>
-        </w:tc>
-        <w:tc>
-          <w:tcPr>
-            <w:tcW w:w="7470" w:type="dxa"/>
-            <w:shd w:val="clear" w:color="auto" w:fill="FFFFFF"/>
+        <w:trPr>
+          <w:trHeight w:val="419"/>
+        </w:trPr>
+        <w:tc>
+          <w:tcPr>
+            <w:tcW w:w="704" w:type="dxa"/>
+            <w:vAlign w:val="center"/>
           </w:tcPr>
           <w:p>
             <w:pPr>
@@ -173,7 +131,15 @@
                 <w:sz w:val="28"/>
               </w:rPr>
             </w:pPr>
-            <w:r>
+          </w:p>
+        </w:tc>
+        <w:tc>
+          <w:tcPr>
+            <w:tcW w:w="2309" w:type="dxa"/>
+            <w:vAlign w:val="center"/>
+          </w:tcPr>
+          <w:p>
+            <w:pPr>
               <w:rPr>
                 <w:rFonts w:ascii="TH Sarabun New" w:hAnsi="TH Sarabun New" w:cs="TH Sarabun New"/>
                 <w:b/>
@@ -181,718 +147,31 @@
                 <w:sz w:val="28"/>
                 <w:cs/>
               </w:rPr>
-              <w:t>สามารถตรวจรักษาผู้ป่วยทางศัลยกรรมที่มาด้วย</w:t>
-            </w:r>
+            </w:pPr>
             <w:r>
               <w:rPr>
                 <w:rFonts w:ascii="TH Sarabun New" w:hAnsi="TH Sarabun New" w:cs="TH Sarabun New"/>
                 <w:b/>
                 <w:bCs/>
                 <w:sz w:val="28"/>
-              </w:rPr>
-              <w:t xml:space="preserve"> acute abdomen </w:t>
-            </w:r>
-            <w:r>
-              <w:rPr>
-                <w:rFonts w:ascii="TH Sarabun New" w:hAnsi="TH Sarabun New" w:cs="TH Sarabun New"/>
+                <w:cs/>
+              </w:rPr>
+              <w:t xml:space="preserve">ครั้งที่ </w:t>
+            </w:r>
+            <w:r>
+              <w:rPr>
+                <w:rFonts w:ascii="TH Sarabun New" w:hAnsi="TH Sarabun New" w:cs="TH Sarabun New" w:hint="cs"/>
                 <w:b/>
                 <w:bCs/>
                 <w:sz w:val="28"/>
                 <w:cs/>
               </w:rPr>
-              <w:t>อย่างเหมาะสม</w:t>
-            </w:r>
-          </w:p>
-        </w:tc>
-      </w:tr>
-      <w:tr>
-        <w:tc>
-          <w:tcPr>
-            <w:tcW w:w="2065" w:type="dxa"/>
-            <w:shd w:val="clear" w:color="auto" w:fill="auto"/>
-          </w:tcPr>
-          <w:p>
-            <w:pPr>
-              <w:rPr>
-                <w:rFonts w:ascii="TH Sarabun New" w:hAnsi="TH Sarabun New" w:cs="TH Sarabun New"/>
-                <w:sz w:val="28"/>
-                <w:cs/>
-              </w:rPr>
-            </w:pPr>
-            <w:r>
-              <w:rPr>
-                <w:rFonts w:ascii="TH Sarabun New" w:hAnsi="TH Sarabun New" w:cs="TH Sarabun New"/>
-                <w:sz w:val="28"/>
-              </w:rPr>
               <w:t>2</w:t>
-            </w:r>
-            <w:r>
-              <w:rPr>
-                <w:rFonts w:ascii="TH Sarabun New" w:hAnsi="TH Sarabun New" w:cs="TH Sarabun New"/>
-                <w:sz w:val="28"/>
-                <w:cs/>
-              </w:rPr>
-              <w:t>.ข้อกำหนด และข้อจำกัดของกิจกรรม (สถานที่ ลักษณะผู้ป่วย)</w:t>
-            </w:r>
-          </w:p>
-        </w:tc>
-        <w:tc>
-          <w:tcPr>
-            <w:tcW w:w="7470" w:type="dxa"/>
-            <w:shd w:val="clear" w:color="auto" w:fill="auto"/>
-          </w:tcPr>
-          <w:p>
-            <w:pPr>
-              <w:spacing w:after="0"/>
-              <w:rPr>
-                <w:rFonts w:ascii="TH Sarabun New" w:hAnsi="TH Sarabun New" w:cs="TH Sarabun New"/>
-                <w:sz w:val="28"/>
-                <w:u w:val="single"/>
-              </w:rPr>
-            </w:pPr>
-            <w:r>
-              <w:rPr>
-                <w:rFonts w:ascii="TH Sarabun New" w:hAnsi="TH Sarabun New" w:cs="TH Sarabun New"/>
-                <w:sz w:val="28"/>
-                <w:u w:val="single"/>
-                <w:cs/>
-              </w:rPr>
-              <w:t>รายละเอียดของกิจกรรม</w:t>
-            </w:r>
-          </w:p>
-          <w:p>
-            <w:pPr>
-              <w:spacing w:after="0"/>
-              <w:rPr>
-                <w:rFonts w:ascii="TH Sarabun New" w:hAnsi="TH Sarabun New" w:cs="TH Sarabun New"/>
-                <w:sz w:val="28"/>
-              </w:rPr>
-            </w:pPr>
-            <w:r>
-              <w:rPr>
-                <w:rFonts w:ascii="TH Sarabun New" w:hAnsi="TH Sarabun New" w:cs="TH Sarabun New"/>
-                <w:sz w:val="28"/>
-                <w:cs/>
-              </w:rPr>
-              <w:t>1.สามารถซักประวัติ ตรวจร่างกาย ผู้ป่วยทางศัลยกรรมที่มาด้วย</w:t>
-            </w:r>
-            <w:r>
-              <w:rPr>
-                <w:rFonts w:ascii="TH Sarabun New" w:hAnsi="TH Sarabun New" w:cs="TH Sarabun New"/>
-                <w:sz w:val="28"/>
-              </w:rPr>
-              <w:t xml:space="preserve"> ACUTE ABDOMEN</w:t>
-            </w:r>
-            <w:r>
-              <w:rPr>
-                <w:rFonts w:ascii="TH Sarabun New" w:hAnsi="TH Sarabun New" w:cs="TH Sarabun New"/>
-                <w:sz w:val="28"/>
-                <w:cs/>
-              </w:rPr>
-              <w:t xml:space="preserve"> อย่างเหมาะสม และรวบรวมข้อมูลที่สำคัญ ได้อย่างถูกต้อง </w:t>
-            </w:r>
-          </w:p>
-          <w:p>
-            <w:pPr>
-              <w:spacing w:after="0"/>
-              <w:rPr>
-                <w:rFonts w:ascii="TH Sarabun New" w:hAnsi="TH Sarabun New" w:cs="TH Sarabun New"/>
-                <w:sz w:val="28"/>
-                <w:cs/>
-              </w:rPr>
-            </w:pPr>
-            <w:r>
-              <w:rPr>
-                <w:rFonts w:ascii="TH Sarabun New" w:hAnsi="TH Sarabun New" w:cs="TH Sarabun New"/>
-                <w:sz w:val="28"/>
-                <w:cs/>
-              </w:rPr>
-              <w:t xml:space="preserve">2.สามารถส่ง </w:t>
-            </w:r>
-            <w:r>
-              <w:rPr>
-                <w:rFonts w:ascii="TH Sarabun New" w:hAnsi="TH Sarabun New" w:cs="TH Sarabun New"/>
-                <w:sz w:val="28"/>
-              </w:rPr>
-              <w:t xml:space="preserve">Investigation </w:t>
-            </w:r>
-            <w:r>
-              <w:rPr>
-                <w:rFonts w:ascii="TH Sarabun New" w:hAnsi="TH Sarabun New" w:cs="TH Sarabun New"/>
-                <w:sz w:val="28"/>
-                <w:cs/>
-              </w:rPr>
-              <w:t xml:space="preserve">และแปลผลได้อย่างถูกต้อง และเหมาะสม โดยคำนึงถึงผลประโยชน์และความเสี่ยงในการส่งตรวจ </w:t>
-            </w:r>
-          </w:p>
-          <w:p>
-            <w:pPr>
-              <w:spacing w:after="0"/>
-              <w:rPr>
-                <w:rFonts w:ascii="TH Sarabun New" w:hAnsi="TH Sarabun New" w:cs="TH Sarabun New"/>
-                <w:sz w:val="28"/>
-              </w:rPr>
-            </w:pPr>
-            <w:r>
-              <w:rPr>
-                <w:rFonts w:ascii="TH Sarabun New" w:hAnsi="TH Sarabun New" w:cs="TH Sarabun New"/>
-                <w:sz w:val="28"/>
-                <w:cs/>
-              </w:rPr>
-              <w:t xml:space="preserve">3.สามารถแจ้งผลการตรวจและวางแผนการผ่าตัดให้แก่ญาติ ได้อย่างเหมาะสม </w:t>
-            </w:r>
-          </w:p>
-          <w:p>
-            <w:pPr>
-              <w:spacing w:after="0"/>
-              <w:rPr>
-                <w:rFonts w:ascii="TH Sarabun New" w:hAnsi="TH Sarabun New" w:cs="TH Sarabun New"/>
-                <w:sz w:val="28"/>
-              </w:rPr>
-            </w:pPr>
-            <w:r>
-              <w:rPr>
-                <w:rFonts w:ascii="TH Sarabun New" w:hAnsi="TH Sarabun New" w:cs="TH Sarabun New"/>
-                <w:sz w:val="28"/>
-                <w:cs/>
-              </w:rPr>
-              <w:t xml:space="preserve">4.สามารถดูแล และเตรียมคนไข้ก่อนผ่าตัด ระยะผ่าตัด ระยะหลังผ่าตัด และวางแผนร่วมกับ สาขาวิชาชีพต่าง ๆ ได้อย่างเหมาะสม </w:t>
-            </w:r>
-          </w:p>
-          <w:p>
-            <w:pPr>
-              <w:spacing w:after="0"/>
-              <w:rPr>
-                <w:rFonts w:ascii="TH Sarabun New" w:hAnsi="TH Sarabun New" w:cs="TH Sarabun New"/>
-                <w:sz w:val="28"/>
-              </w:rPr>
-            </w:pPr>
-            <w:r>
-              <w:rPr>
-                <w:rFonts w:ascii="TH Sarabun New" w:hAnsi="TH Sarabun New" w:cs="TH Sarabun New"/>
-                <w:sz w:val="28"/>
-                <w:cs/>
-              </w:rPr>
-              <w:t xml:space="preserve">5.สามารถแสดงหรือ อธิบายขั้นตอน การผ่าตัดได้อย่างละเอียดถูกต้อง รวมถึง วิธีป้องกัน และรักษาภาวะแทรกซ้อน </w:t>
-            </w:r>
-          </w:p>
-          <w:p>
-            <w:pPr>
-              <w:spacing w:after="0"/>
-              <w:rPr>
-                <w:rFonts w:ascii="TH Sarabun New" w:hAnsi="TH Sarabun New" w:cs="TH Sarabun New"/>
-                <w:sz w:val="28"/>
-              </w:rPr>
-            </w:pPr>
-            <w:r>
-              <w:rPr>
-                <w:rFonts w:ascii="TH Sarabun New" w:hAnsi="TH Sarabun New" w:cs="TH Sarabun New"/>
-                <w:sz w:val="28"/>
-                <w:cs/>
-              </w:rPr>
-              <w:t xml:space="preserve">6.มีการวางแผนการจำหน่ายผู้ป่วยร่วมกับ สหสาขาวิชาชีพ </w:t>
-            </w:r>
-          </w:p>
-          <w:p>
-            <w:pPr>
-              <w:spacing w:after="0"/>
-              <w:rPr>
-                <w:rFonts w:ascii="TH Sarabun New" w:hAnsi="TH Sarabun New" w:cs="TH Sarabun New"/>
-                <w:sz w:val="28"/>
-                <w:cs/>
-              </w:rPr>
-            </w:pPr>
-            <w:r>
-              <w:rPr>
-                <w:rFonts w:ascii="TH Sarabun New" w:hAnsi="TH Sarabun New" w:cs="TH Sarabun New"/>
-                <w:sz w:val="28"/>
-                <w:cs/>
-              </w:rPr>
-              <w:t xml:space="preserve">7.สามารถศึกษาหาความรู้รวมถึงงานวิจัยใหม่ ๆ ที่เกี่ยวข้อกับผู้ป่วยได้ </w:t>
-            </w:r>
-          </w:p>
-        </w:tc>
-      </w:tr>
-      <w:tr>
-        <w:tc>
-          <w:tcPr>
-            <w:tcW w:w="2065" w:type="dxa"/>
-            <w:shd w:val="clear" w:color="auto" w:fill="auto"/>
-          </w:tcPr>
-          <w:p>
-            <w:pPr>
-              <w:rPr>
-                <w:rFonts w:ascii="TH Sarabun New" w:hAnsi="TH Sarabun New" w:cs="TH Sarabun New"/>
-                <w:sz w:val="28"/>
-              </w:rPr>
-            </w:pPr>
-            <w:r>
-              <w:rPr>
-                <w:rFonts w:ascii="TH Sarabun New" w:hAnsi="TH Sarabun New" w:cs="TH Sarabun New"/>
-                <w:sz w:val="28"/>
-              </w:rPr>
-              <w:t>3</w:t>
-            </w:r>
-            <w:r>
-              <w:rPr>
-                <w:rFonts w:ascii="TH Sarabun New" w:hAnsi="TH Sarabun New" w:cs="TH Sarabun New"/>
-                <w:sz w:val="28"/>
-                <w:cs/>
-              </w:rPr>
-              <w:t>.ข้อกำหนดด้านประสบการณ์ความรู้ ทักษะทัศนคติ พฤติกรรม</w:t>
-            </w:r>
-          </w:p>
-        </w:tc>
-        <w:tc>
-          <w:tcPr>
-            <w:tcW w:w="7470" w:type="dxa"/>
-            <w:shd w:val="clear" w:color="auto" w:fill="auto"/>
-          </w:tcPr>
-          <w:p>
-            <w:pPr>
-              <w:spacing w:after="0"/>
-              <w:rPr>
-                <w:rFonts w:ascii="TH Sarabun New" w:hAnsi="TH Sarabun New" w:cs="TH Sarabun New"/>
-                <w:sz w:val="28"/>
-                <w:u w:val="single"/>
-              </w:rPr>
-            </w:pPr>
-            <w:r>
-              <w:rPr>
-                <w:rFonts w:ascii="TH Sarabun New" w:hAnsi="TH Sarabun New" w:cs="TH Sarabun New"/>
-                <w:sz w:val="28"/>
-                <w:u w:val="single"/>
-                <w:cs/>
-              </w:rPr>
-              <w:t>ความรู้ ทักษะ เจตคติ ที่จำเป็นต้องมี</w:t>
-            </w:r>
-          </w:p>
-          <w:p>
-            <w:pPr>
-              <w:spacing w:after="0"/>
-              <w:rPr>
-                <w:rFonts w:ascii="TH Sarabun New" w:hAnsi="TH Sarabun New" w:cs="TH Sarabun New"/>
-                <w:sz w:val="28"/>
-              </w:rPr>
-            </w:pPr>
-            <w:r>
-              <w:rPr>
-                <w:rFonts w:ascii="TH Sarabun New" w:hAnsi="TH Sarabun New" w:cs="TH Sarabun New"/>
-                <w:sz w:val="28"/>
-              </w:rPr>
-              <w:t>3</w:t>
-            </w:r>
-            <w:r>
-              <w:rPr>
-                <w:rFonts w:ascii="TH Sarabun New" w:hAnsi="TH Sarabun New" w:cs="TH Sarabun New"/>
-                <w:sz w:val="28"/>
-                <w:cs/>
-              </w:rPr>
-              <w:t>.1 ความรู้พื้นฐานเรื่องการดูแลผู้ป่วยทางศัลยกรรมที่มาด้วย</w:t>
-            </w:r>
-            <w:r>
-              <w:rPr>
-                <w:rFonts w:ascii="TH Sarabun New" w:hAnsi="TH Sarabun New" w:cs="TH Sarabun New"/>
-                <w:sz w:val="28"/>
-              </w:rPr>
-              <w:t xml:space="preserve"> ACUTE ABDOMEN</w:t>
-            </w:r>
-            <w:r>
-              <w:rPr>
-                <w:rFonts w:ascii="TH Sarabun New" w:hAnsi="TH Sarabun New" w:cs="TH Sarabun New"/>
-                <w:sz w:val="28"/>
-                <w:cs/>
-              </w:rPr>
-              <w:t xml:space="preserve"> อย่างเหมาะสม และรู้ ข้อบ่งชี้ ของการผ่าตัด ข้อห้าม ภาวะแทรกซ้อน การดูแลรักษาเมื่อมีภาพวะแทรกซ้อน ตลอดจนความรู้เกี่ยวกับการแปลผลการตรวจ</w:t>
-            </w:r>
-          </w:p>
-          <w:p>
-            <w:pPr>
-              <w:spacing w:after="0"/>
-              <w:rPr>
-                <w:rFonts w:ascii="TH Sarabun New" w:hAnsi="TH Sarabun New" w:cs="TH Sarabun New"/>
-                <w:sz w:val="28"/>
-              </w:rPr>
-            </w:pPr>
-            <w:r>
-              <w:rPr>
-                <w:rFonts w:ascii="TH Sarabun New" w:hAnsi="TH Sarabun New" w:cs="TH Sarabun New"/>
-                <w:sz w:val="28"/>
-              </w:rPr>
-              <w:t>3</w:t>
-            </w:r>
-            <w:r>
-              <w:rPr>
-                <w:rFonts w:ascii="TH Sarabun New" w:hAnsi="TH Sarabun New" w:cs="TH Sarabun New"/>
-                <w:sz w:val="28"/>
-                <w:cs/>
-              </w:rPr>
-              <w:t>.2 ทักษะการสื่อสาร ให้ข้อมูลเพื่อให้ได้รับความยินยอมจากผู้ป่วยหรือญาติ ตามความเหมาะสม (</w:t>
-            </w:r>
-            <w:r>
-              <w:rPr>
-                <w:rFonts w:ascii="TH Sarabun New" w:hAnsi="TH Sarabun New" w:cs="TH Sarabun New"/>
-                <w:sz w:val="28"/>
-              </w:rPr>
-              <w:t>Consent and assent</w:t>
-            </w:r>
-            <w:r>
-              <w:rPr>
-                <w:rFonts w:ascii="TH Sarabun New" w:hAnsi="TH Sarabun New" w:cs="TH Sarabun New"/>
-                <w:sz w:val="28"/>
-                <w:cs/>
-              </w:rPr>
-              <w:t>) ตลอดจนการให้คำแนะนำ และมีปฏิสัมพันธ์</w:t>
-            </w:r>
-          </w:p>
-          <w:p>
-            <w:pPr>
-              <w:spacing w:after="0"/>
-              <w:rPr>
-                <w:rFonts w:ascii="TH Sarabun New" w:hAnsi="TH Sarabun New" w:cs="TH Sarabun New"/>
-                <w:sz w:val="28"/>
-              </w:rPr>
-            </w:pPr>
-            <w:r>
-              <w:rPr>
-                <w:rFonts w:ascii="TH Sarabun New" w:hAnsi="TH Sarabun New" w:cs="TH Sarabun New"/>
-                <w:sz w:val="28"/>
-              </w:rPr>
-              <w:t>3</w:t>
-            </w:r>
-            <w:r>
-              <w:rPr>
-                <w:rFonts w:ascii="TH Sarabun New" w:hAnsi="TH Sarabun New" w:cs="TH Sarabun New"/>
-                <w:sz w:val="28"/>
-                <w:cs/>
-              </w:rPr>
-              <w:t>.3 พฤตินิสัยและเจตคติที่ดีต่อวิชาชีพแพทย์ มีคุณธรรม จริยธรรมและจรรยาบรรณแห่งวิชาชีพ</w:t>
-            </w:r>
-          </w:p>
-          <w:p>
-            <w:pPr>
-              <w:spacing w:after="0"/>
-              <w:rPr>
-                <w:rFonts w:ascii="TH Sarabun New" w:hAnsi="TH Sarabun New" w:cs="TH Sarabun New"/>
-                <w:sz w:val="28"/>
-                <w:cs/>
-              </w:rPr>
-            </w:pPr>
-            <w:r>
-              <w:rPr>
-                <w:rFonts w:ascii="TH Sarabun New" w:hAnsi="TH Sarabun New" w:cs="TH Sarabun New"/>
-                <w:sz w:val="28"/>
-              </w:rPr>
-              <w:t>3</w:t>
-            </w:r>
-            <w:r>
-              <w:rPr>
-                <w:rFonts w:ascii="TH Sarabun New" w:hAnsi="TH Sarabun New" w:cs="TH Sarabun New"/>
-                <w:sz w:val="28"/>
-                <w:cs/>
-              </w:rPr>
-              <w:t>.4 การกำหนดความต้องการในการเรียนรู้ของตนเองได้อย่างครอบคลุมทุกด้านที่จำเป็น รู้จักวางแผนและแสวงหาวิธีการสร้างและพัฒนาความรู้ รวมทั้งพัฒนาตนเองอย่างต่อเนื่องและสม่ำเสมอ</w:t>
-            </w:r>
-          </w:p>
-        </w:tc>
-      </w:tr>
-      <w:tr>
-        <w:tc>
-          <w:tcPr>
-            <w:tcW w:w="2065" w:type="dxa"/>
-            <w:shd w:val="clear" w:color="auto" w:fill="auto"/>
-          </w:tcPr>
-          <w:p>
-            <w:pPr>
-              <w:rPr>
-                <w:rFonts w:ascii="TH Sarabun New" w:hAnsi="TH Sarabun New" w:cs="TH Sarabun New"/>
-                <w:sz w:val="28"/>
-              </w:rPr>
-            </w:pPr>
-            <w:r>
-              <w:rPr>
-                <w:rFonts w:ascii="TH Sarabun New" w:hAnsi="TH Sarabun New" w:cs="TH Sarabun New"/>
-                <w:sz w:val="28"/>
-              </w:rPr>
-              <w:t>4</w:t>
-            </w:r>
-            <w:r>
-              <w:rPr>
-                <w:rFonts w:ascii="TH Sarabun New" w:hAnsi="TH Sarabun New" w:cs="TH Sarabun New"/>
-                <w:sz w:val="28"/>
-                <w:cs/>
-              </w:rPr>
-              <w:t>.การวัดและการประเมินผล</w:t>
-            </w:r>
-          </w:p>
-        </w:tc>
-        <w:tc>
-          <w:tcPr>
-            <w:tcW w:w="7470" w:type="dxa"/>
-            <w:shd w:val="clear" w:color="auto" w:fill="auto"/>
-          </w:tcPr>
-          <w:p>
-            <w:pPr>
-              <w:spacing w:after="0"/>
-              <w:rPr>
-                <w:rFonts w:ascii="TH Sarabun New" w:hAnsi="TH Sarabun New" w:cs="TH Sarabun New"/>
-                <w:sz w:val="28"/>
-              </w:rPr>
-            </w:pPr>
-            <w:r>
-              <w:rPr>
-                <w:rFonts w:ascii="TH Sarabun New" w:hAnsi="TH Sarabun New" w:cs="TH Sarabun New"/>
-                <w:sz w:val="28"/>
-                <w:cs/>
-              </w:rPr>
-              <w:t>วิธีการประเมินระดับความสามารถ</w:t>
-            </w:r>
-          </w:p>
-          <w:p>
-            <w:pPr>
-              <w:spacing w:after="0"/>
-              <w:rPr>
-                <w:rFonts w:ascii="TH Sarabun New" w:hAnsi="TH Sarabun New" w:cs="TH Sarabun New"/>
-                <w:sz w:val="28"/>
-                <w:cs/>
-              </w:rPr>
-            </w:pPr>
-            <w:r>
-              <w:rPr>
-                <w:rFonts w:ascii="TH Sarabun New" w:hAnsi="TH Sarabun New" w:cs="TH Sarabun New"/>
-                <w:sz w:val="28"/>
-              </w:rPr>
-              <w:t>4</w:t>
-            </w:r>
-            <w:r>
-              <w:rPr>
-                <w:rFonts w:ascii="TH Sarabun New" w:hAnsi="TH Sarabun New" w:cs="TH Sarabun New"/>
-                <w:sz w:val="28"/>
-                <w:cs/>
-              </w:rPr>
-              <w:t xml:space="preserve">.1 การสังเกตระหว่างการปฏิบัติงานโดยอาจารย์อย่างน้อย หรือ การทดสอบผู้ป่วยจำลอง หรือ ตัวอย่าง </w:t>
-            </w:r>
-            <w:r>
-              <w:rPr>
-                <w:rFonts w:ascii="TH Sarabun New" w:hAnsi="TH Sarabun New" w:cs="TH Sarabun New"/>
-                <w:sz w:val="28"/>
-              </w:rPr>
-              <w:t>case discussion</w:t>
-            </w:r>
-            <w:r>
-              <w:rPr>
-                <w:rFonts w:ascii="TH Sarabun New" w:hAnsi="TH Sarabun New" w:cs="TH Sarabun New"/>
-                <w:sz w:val="28"/>
-                <w:cs/>
-              </w:rPr>
-              <w:t xml:space="preserve"> ในหอผู้ป่วยต่าง ๆ กัน </w:t>
-            </w:r>
-          </w:p>
-        </w:tc>
-      </w:tr>
-      <w:tr>
-        <w:tc>
-          <w:tcPr>
-            <w:tcW w:w="2065" w:type="dxa"/>
-            <w:shd w:val="clear" w:color="auto" w:fill="auto"/>
-          </w:tcPr>
-          <w:p>
-            <w:pPr>
-              <w:spacing w:after="0"/>
-              <w:rPr>
-                <w:rFonts w:ascii="TH Sarabun New" w:hAnsi="TH Sarabun New" w:cs="TH Sarabun New"/>
-                <w:sz w:val="28"/>
-              </w:rPr>
-            </w:pPr>
-            <w:r>
-              <w:rPr>
-                <w:rFonts w:ascii="TH Sarabun New" w:hAnsi="TH Sarabun New" w:cs="TH Sarabun New"/>
-                <w:sz w:val="28"/>
-              </w:rPr>
-              <w:t>5</w:t>
-            </w:r>
-            <w:r>
-              <w:rPr>
-                <w:rFonts w:ascii="TH Sarabun New" w:hAnsi="TH Sarabun New" w:cs="TH Sarabun New"/>
-                <w:sz w:val="28"/>
-                <w:cs/>
-              </w:rPr>
-              <w:t xml:space="preserve">.ระดับความสามารถตาม </w:t>
-            </w:r>
-            <w:r>
-              <w:rPr>
-                <w:rFonts w:ascii="TH Sarabun New" w:hAnsi="TH Sarabun New" w:cs="TH Sarabun New"/>
-                <w:sz w:val="28"/>
-              </w:rPr>
-              <w:t xml:space="preserve">EPA </w:t>
-            </w:r>
-            <w:r>
-              <w:rPr>
-                <w:rFonts w:ascii="TH Sarabun New" w:hAnsi="TH Sarabun New" w:cs="TH Sarabun New"/>
-                <w:sz w:val="28"/>
-                <w:cs/>
-              </w:rPr>
-              <w:t>ของแพทย์ประจำบ้านของแต่ละ</w:t>
-            </w:r>
-          </w:p>
-          <w:p>
-            <w:pPr>
-              <w:spacing w:after="0"/>
-              <w:rPr>
-                <w:rFonts w:ascii="TH Sarabun New" w:hAnsi="TH Sarabun New" w:cs="TH Sarabun New"/>
-                <w:sz w:val="28"/>
-                <w:cs/>
-              </w:rPr>
-            </w:pPr>
-            <w:r>
-              <w:rPr>
-                <w:rFonts w:ascii="TH Sarabun New" w:hAnsi="TH Sarabun New" w:cs="TH Sarabun New"/>
-                <w:sz w:val="28"/>
-                <w:cs/>
-              </w:rPr>
-              <w:t>ชั้นปี</w:t>
-            </w:r>
-          </w:p>
-        </w:tc>
-        <w:tc>
-          <w:tcPr>
-            <w:tcW w:w="7470" w:type="dxa"/>
-            <w:shd w:val="clear" w:color="auto" w:fill="auto"/>
-          </w:tcPr>
-          <w:p>
-            <w:pPr>
-              <w:spacing w:after="0"/>
-              <w:rPr>
-                <w:rFonts w:ascii="TH Sarabun New" w:hAnsi="TH Sarabun New" w:cs="TH Sarabun New"/>
-                <w:sz w:val="28"/>
-              </w:rPr>
-            </w:pPr>
-            <w:r>
-              <w:rPr>
-                <w:rFonts w:ascii="TH Sarabun New" w:hAnsi="TH Sarabun New" w:cs="TH Sarabun New"/>
-                <w:sz w:val="28"/>
-                <w:cs/>
-              </w:rPr>
-              <w:t xml:space="preserve">ระดับความสามารถที่พึงมี </w:t>
-            </w:r>
-          </w:p>
-          <w:p>
-            <w:pPr>
-              <w:spacing w:after="0"/>
-              <w:rPr>
-                <w:rFonts w:ascii="TH Sarabun New" w:hAnsi="TH Sarabun New" w:cs="TH Sarabun New"/>
-                <w:sz w:val="28"/>
-              </w:rPr>
-            </w:pPr>
-            <w:r>
-              <w:rPr>
-                <w:rFonts w:ascii="TH Sarabun New" w:hAnsi="TH Sarabun New" w:cs="TH Sarabun New"/>
-                <w:sz w:val="28"/>
-                <w:cs/>
-              </w:rPr>
-              <w:t xml:space="preserve">ต้องมีความสามารถอย่างน้อยระดับ </w:t>
-            </w:r>
-            <w:r>
-              <w:rPr>
-                <w:rFonts w:ascii="TH Sarabun New" w:hAnsi="TH Sarabun New" w:cs="TH Sarabun New"/>
-                <w:sz w:val="28"/>
-              </w:rPr>
-              <w:t xml:space="preserve">L3 </w:t>
-            </w:r>
-            <w:r>
-              <w:rPr>
-                <w:rFonts w:ascii="TH Sarabun New" w:hAnsi="TH Sarabun New" w:cs="TH Sarabun New"/>
-                <w:sz w:val="28"/>
-                <w:cs/>
-              </w:rPr>
-              <w:t xml:space="preserve">สำหรับการเลื่อนชั้นไปอยู่ระดับการฝึกอบรมหรือชั้นปีที่ 2 </w:t>
-            </w:r>
-          </w:p>
-          <w:p>
-            <w:pPr>
-              <w:spacing w:after="0"/>
-              <w:rPr>
-                <w:rFonts w:ascii="TH Sarabun New" w:hAnsi="TH Sarabun New" w:cs="TH Sarabun New"/>
-                <w:sz w:val="28"/>
-              </w:rPr>
-            </w:pPr>
-            <w:r>
-              <w:rPr>
-                <w:rFonts w:ascii="TH Sarabun New" w:hAnsi="TH Sarabun New" w:cs="TH Sarabun New"/>
-                <w:sz w:val="28"/>
-                <w:cs/>
-              </w:rPr>
-              <w:t xml:space="preserve">ต้องมีความสามารถอย่างน้อยระดับ </w:t>
-            </w:r>
-            <w:r>
-              <w:rPr>
-                <w:rFonts w:ascii="TH Sarabun New" w:hAnsi="TH Sarabun New" w:cs="TH Sarabun New"/>
-                <w:sz w:val="28"/>
-              </w:rPr>
-              <w:t xml:space="preserve">L4 </w:t>
-            </w:r>
-            <w:r>
-              <w:rPr>
-                <w:rFonts w:ascii="TH Sarabun New" w:hAnsi="TH Sarabun New" w:cs="TH Sarabun New"/>
-                <w:sz w:val="28"/>
-                <w:cs/>
-              </w:rPr>
-              <w:t>สำหรับการเลื่อนชั้นไปอยู่ระดับการฝึกอบรมหรือชั้นปีที่ 3</w:t>
-            </w:r>
-          </w:p>
-          <w:p>
-            <w:pPr>
-              <w:spacing w:after="0"/>
-              <w:rPr>
-                <w:rFonts w:ascii="TH Sarabun New" w:hAnsi="TH Sarabun New" w:cs="TH Sarabun New"/>
-                <w:sz w:val="28"/>
-                <w:cs/>
-              </w:rPr>
-            </w:pPr>
-            <w:r>
-              <w:rPr>
-                <w:rFonts w:ascii="TH Sarabun New" w:hAnsi="TH Sarabun New" w:cs="TH Sarabun New"/>
-                <w:sz w:val="28"/>
-                <w:cs/>
-              </w:rPr>
-              <w:t xml:space="preserve">ต้องมีความสามารถอย่างน้อยระดับ </w:t>
-            </w:r>
-            <w:r>
-              <w:rPr>
-                <w:rFonts w:ascii="TH Sarabun New" w:hAnsi="TH Sarabun New" w:cs="TH Sarabun New"/>
-                <w:sz w:val="28"/>
-              </w:rPr>
-              <w:t>L5</w:t>
-            </w:r>
-            <w:r>
-              <w:rPr>
-                <w:rFonts w:ascii="TH Sarabun New" w:hAnsi="TH Sarabun New" w:cs="TH Sarabun New"/>
-                <w:sz w:val="28"/>
-                <w:cs/>
-              </w:rPr>
-              <w:t xml:space="preserve"> เมื่อสิ้นสุดการฝึกอบรมในระดับหรือชั้นปีที่ 4 ในส่วนการผ่าตัด ต้องมีความสามารถอย่างน้อยระดับ </w:t>
-            </w:r>
-            <w:r>
-              <w:rPr>
-                <w:rFonts w:ascii="TH Sarabun New" w:hAnsi="TH Sarabun New" w:cs="TH Sarabun New"/>
-                <w:sz w:val="28"/>
-              </w:rPr>
-              <w:t>L4</w:t>
             </w:r>
           </w:p>
         </w:tc>
       </w:tr>
     </w:tbl>
-    <w:p>
-      <w:pPr>
-        <w:rPr>
-          <w:rFonts w:ascii="TH Sarabun New" w:hAnsi="TH Sarabun New" w:cs="TH Sarabun New"/>
-          <w:b/>
-          <w:bCs/>
-          <w:sz w:val="28"/>
-        </w:rPr>
-      </w:pPr>
-    </w:p>
     <w:p>
       <w:pPr>
         <w:rPr>
@@ -961,10 +240,38 @@
         <w:t xml:space="preserve"> </w:t>
       </w:r>
     </w:p>
+    <w:p>
+      <w:pPr>
+        <w:rPr>
+          <w:rFonts w:ascii="TH Sarabun New" w:hAnsi="TH Sarabun New" w:cs="TH Sarabun New"/>
+          <w:b/>
+          <w:bCs/>
+          <w:sz w:val="28"/>
+        </w:rPr>
+      </w:pPr>
+    </w:p>
+    <w:p>
+      <w:pPr>
+        <w:rPr>
+          <w:rFonts w:ascii="TH Sarabun New" w:hAnsi="TH Sarabun New" w:cs="TH Sarabun New"/>
+          <w:sz w:val="28"/>
+        </w:rPr>
+      </w:pPr>
+    </w:p>
+    <w:p>
+      <w:pPr>
+        <w:rPr>
+          <w:rFonts w:ascii="TH Sarabun New" w:hAnsi="TH Sarabun New" w:cs="TH Sarabun New" w:hint="cs"/>
+          <w:sz w:val="28"/>
+        </w:rPr>
+      </w:pPr>
+      <w:bookmarkStart w:id="0" w:name="_GoBack"/>
+      <w:bookmarkEnd w:id="0"/>
+    </w:p>
     <w:tbl>
       <w:tblPr>
-        <w:tblW w:w="9922" w:type="dxa"/>
-        <w:tblInd w:w="-5" w:type="dxa"/>
+        <w:tblW w:w="10631" w:type="dxa"/>
+        <w:tblInd w:w="-714" w:type="dxa"/>
         <w:tblBorders>
           <w:top w:val="single" w:sz="4" w:space="0" w:color="auto"/>
           <w:left w:val="single" w:sz="4" w:space="0" w:color="auto"/>
@@ -977,17 +284,17 @@
         <w:tblLook w:val="04A0" w:firstRow="1" w:lastRow="0" w:firstColumn="1" w:lastColumn="0" w:noHBand="0" w:noVBand="1"/>
       </w:tblPr>
       <w:tblGrid>
-        <w:gridCol w:w="4678"/>
-        <w:gridCol w:w="1134"/>
-        <w:gridCol w:w="1134"/>
-        <w:gridCol w:w="992"/>
-        <w:gridCol w:w="992"/>
-        <w:gridCol w:w="992"/>
+        <w:gridCol w:w="7797"/>
+        <w:gridCol w:w="567"/>
+        <w:gridCol w:w="567"/>
+        <w:gridCol w:w="567"/>
+        <w:gridCol w:w="567"/>
+        <w:gridCol w:w="566"/>
       </w:tblGrid>
       <w:tr>
         <w:tc>
           <w:tcPr>
-            <w:tcW w:w="4678" w:type="dxa"/>
+            <w:tcW w:w="7797" w:type="dxa"/>
             <w:tcBorders>
               <w:bottom w:val="single" w:sz="4" w:space="0" w:color="auto"/>
             </w:tcBorders>
@@ -1017,7 +324,7 @@
         </w:tc>
         <w:tc>
           <w:tcPr>
-            <w:tcW w:w="1134" w:type="dxa"/>
+            <w:tcW w:w="567" w:type="dxa"/>
             <w:tcBorders>
               <w:bottom w:val="single" w:sz="4" w:space="0" w:color="auto"/>
             </w:tcBorders>
@@ -1046,7 +353,7 @@
         </w:tc>
         <w:tc>
           <w:tcPr>
-            <w:tcW w:w="1134" w:type="dxa"/>
+            <w:tcW w:w="567" w:type="dxa"/>
             <w:tcBorders>
               <w:bottom w:val="single" w:sz="4" w:space="0" w:color="auto"/>
             </w:tcBorders>
@@ -1075,7 +382,7 @@
         </w:tc>
         <w:tc>
           <w:tcPr>
-            <w:tcW w:w="992" w:type="dxa"/>
+            <w:tcW w:w="567" w:type="dxa"/>
             <w:tcBorders>
               <w:bottom w:val="single" w:sz="4" w:space="0" w:color="auto"/>
             </w:tcBorders>
@@ -1104,7 +411,7 @@
         </w:tc>
         <w:tc>
           <w:tcPr>
-            <w:tcW w:w="992" w:type="dxa"/>
+            <w:tcW w:w="567" w:type="dxa"/>
             <w:tcBorders>
               <w:bottom w:val="single" w:sz="4" w:space="0" w:color="auto"/>
             </w:tcBorders>
@@ -1133,7 +440,7 @@
         </w:tc>
         <w:tc>
           <w:tcPr>
-            <w:tcW w:w="992" w:type="dxa"/>
+            <w:tcW w:w="566" w:type="dxa"/>
             <w:tcBorders>
               <w:bottom w:val="single" w:sz="4" w:space="0" w:color="auto"/>
             </w:tcBorders>
@@ -1164,7 +471,7 @@
       <w:tr>
         <w:tc>
           <w:tcPr>
-            <w:tcW w:w="4678" w:type="dxa"/>
+            <w:tcW w:w="7797" w:type="dxa"/>
             <w:tcBorders>
               <w:bottom w:val="nil"/>
             </w:tcBorders>
@@ -1204,7 +511,7 @@
         </w:tc>
         <w:tc>
           <w:tcPr>
-            <w:tcW w:w="1134" w:type="dxa"/>
+            <w:tcW w:w="567" w:type="dxa"/>
             <w:tcBorders>
               <w:bottom w:val="dotted" w:sz="4" w:space="0" w:color="auto"/>
             </w:tcBorders>
@@ -1221,7 +528,7 @@
         </w:tc>
         <w:tc>
           <w:tcPr>
-            <w:tcW w:w="1134" w:type="dxa"/>
+            <w:tcW w:w="567" w:type="dxa"/>
             <w:tcBorders>
               <w:bottom w:val="dotted" w:sz="4" w:space="0" w:color="auto"/>
             </w:tcBorders>
@@ -1238,7 +545,7 @@
         </w:tc>
         <w:tc>
           <w:tcPr>
-            <w:tcW w:w="992" w:type="dxa"/>
+            <w:tcW w:w="567" w:type="dxa"/>
             <w:tcBorders>
               <w:bottom w:val="dotted" w:sz="4" w:space="0" w:color="auto"/>
             </w:tcBorders>
@@ -1255,7 +562,7 @@
         </w:tc>
         <w:tc>
           <w:tcPr>
-            <w:tcW w:w="992" w:type="dxa"/>
+            <w:tcW w:w="567" w:type="dxa"/>
             <w:tcBorders>
               <w:bottom w:val="dotted" w:sz="4" w:space="0" w:color="auto"/>
             </w:tcBorders>
@@ -1272,7 +579,7 @@
         </w:tc>
         <w:tc>
           <w:tcPr>
-            <w:tcW w:w="992" w:type="dxa"/>
+            <w:tcW w:w="566" w:type="dxa"/>
             <w:tcBorders>
               <w:bottom w:val="dotted" w:sz="4" w:space="0" w:color="auto"/>
             </w:tcBorders>
@@ -1291,7 +598,7 @@
       <w:tr>
         <w:tc>
           <w:tcPr>
-            <w:tcW w:w="4678" w:type="dxa"/>
+            <w:tcW w:w="7797" w:type="dxa"/>
             <w:tcBorders>
               <w:top w:val="single" w:sz="4" w:space="0" w:color="auto"/>
               <w:bottom w:val="single" w:sz="4" w:space="0" w:color="auto"/>
@@ -1332,7 +639,7 @@
         </w:tc>
         <w:tc>
           <w:tcPr>
-            <w:tcW w:w="1134" w:type="dxa"/>
+            <w:tcW w:w="567" w:type="dxa"/>
             <w:tcBorders>
               <w:top w:val="dotted" w:sz="4" w:space="0" w:color="auto"/>
               <w:left w:val="single" w:sz="4" w:space="0" w:color="auto"/>
@@ -1352,7 +659,7 @@
         </w:tc>
         <w:tc>
           <w:tcPr>
-            <w:tcW w:w="1134" w:type="dxa"/>
+            <w:tcW w:w="567" w:type="dxa"/>
             <w:tcBorders>
               <w:top w:val="dotted" w:sz="4" w:space="0" w:color="auto"/>
               <w:left w:val="single" w:sz="4" w:space="0" w:color="auto"/>
@@ -1372,7 +679,7 @@
         </w:tc>
         <w:tc>
           <w:tcPr>
-            <w:tcW w:w="992" w:type="dxa"/>
+            <w:tcW w:w="567" w:type="dxa"/>
             <w:tcBorders>
               <w:top w:val="dotted" w:sz="4" w:space="0" w:color="auto"/>
               <w:left w:val="single" w:sz="4" w:space="0" w:color="auto"/>
@@ -1392,7 +699,7 @@
         </w:tc>
         <w:tc>
           <w:tcPr>
-            <w:tcW w:w="992" w:type="dxa"/>
+            <w:tcW w:w="567" w:type="dxa"/>
             <w:tcBorders>
               <w:top w:val="dotted" w:sz="4" w:space="0" w:color="auto"/>
               <w:left w:val="single" w:sz="4" w:space="0" w:color="auto"/>
@@ -1412,7 +719,7 @@
         </w:tc>
         <w:tc>
           <w:tcPr>
-            <w:tcW w:w="992" w:type="dxa"/>
+            <w:tcW w:w="566" w:type="dxa"/>
             <w:tcBorders>
               <w:top w:val="dotted" w:sz="4" w:space="0" w:color="auto"/>
               <w:left w:val="single" w:sz="4" w:space="0" w:color="auto"/>
@@ -1434,7 +741,7 @@
       <w:tr>
         <w:tc>
           <w:tcPr>
-            <w:tcW w:w="4678" w:type="dxa"/>
+            <w:tcW w:w="7797" w:type="dxa"/>
             <w:tcBorders>
               <w:top w:val="single" w:sz="4" w:space="0" w:color="auto"/>
               <w:bottom w:val="single" w:sz="4" w:space="0" w:color="auto"/>
@@ -1461,7 +768,7 @@
         </w:tc>
         <w:tc>
           <w:tcPr>
-            <w:tcW w:w="1134" w:type="dxa"/>
+            <w:tcW w:w="567" w:type="dxa"/>
             <w:tcBorders>
               <w:top w:val="single" w:sz="4" w:space="0" w:color="auto"/>
               <w:left w:val="single" w:sz="4" w:space="0" w:color="auto"/>
@@ -1481,7 +788,7 @@
         </w:tc>
         <w:tc>
           <w:tcPr>
-            <w:tcW w:w="1134" w:type="dxa"/>
+            <w:tcW w:w="567" w:type="dxa"/>
             <w:tcBorders>
               <w:top w:val="single" w:sz="4" w:space="0" w:color="auto"/>
               <w:left w:val="single" w:sz="4" w:space="0" w:color="auto"/>
@@ -1501,7 +808,7 @@
         </w:tc>
         <w:tc>
           <w:tcPr>
-            <w:tcW w:w="992" w:type="dxa"/>
+            <w:tcW w:w="567" w:type="dxa"/>
             <w:tcBorders>
               <w:top w:val="single" w:sz="4" w:space="0" w:color="auto"/>
               <w:left w:val="single" w:sz="4" w:space="0" w:color="auto"/>
@@ -1521,7 +828,7 @@
         </w:tc>
         <w:tc>
           <w:tcPr>
-            <w:tcW w:w="992" w:type="dxa"/>
+            <w:tcW w:w="567" w:type="dxa"/>
             <w:tcBorders>
               <w:top w:val="single" w:sz="4" w:space="0" w:color="auto"/>
               <w:left w:val="single" w:sz="4" w:space="0" w:color="auto"/>
@@ -1541,7 +848,7 @@
         </w:tc>
         <w:tc>
           <w:tcPr>
-            <w:tcW w:w="992" w:type="dxa"/>
+            <w:tcW w:w="566" w:type="dxa"/>
             <w:tcBorders>
               <w:top w:val="single" w:sz="4" w:space="0" w:color="auto"/>
               <w:left w:val="single" w:sz="4" w:space="0" w:color="auto"/>
@@ -1563,7 +870,7 @@
       <w:tr>
         <w:tc>
           <w:tcPr>
-            <w:tcW w:w="4678" w:type="dxa"/>
+            <w:tcW w:w="7797" w:type="dxa"/>
             <w:tcBorders>
               <w:top w:val="single" w:sz="4" w:space="0" w:color="auto"/>
               <w:bottom w:val="single" w:sz="4" w:space="0" w:color="auto"/>
@@ -1590,7 +897,7 @@
         </w:tc>
         <w:tc>
           <w:tcPr>
-            <w:tcW w:w="1134" w:type="dxa"/>
+            <w:tcW w:w="567" w:type="dxa"/>
             <w:tcBorders>
               <w:top w:val="dotted" w:sz="4" w:space="0" w:color="auto"/>
               <w:left w:val="single" w:sz="4" w:space="0" w:color="auto"/>
@@ -1610,7 +917,7 @@
         </w:tc>
         <w:tc>
           <w:tcPr>
-            <w:tcW w:w="1134" w:type="dxa"/>
+            <w:tcW w:w="567" w:type="dxa"/>
             <w:tcBorders>
               <w:top w:val="dotted" w:sz="4" w:space="0" w:color="auto"/>
               <w:left w:val="single" w:sz="4" w:space="0" w:color="auto"/>
@@ -1630,7 +937,7 @@
         </w:tc>
         <w:tc>
           <w:tcPr>
-            <w:tcW w:w="992" w:type="dxa"/>
+            <w:tcW w:w="567" w:type="dxa"/>
             <w:tcBorders>
               <w:top w:val="dotted" w:sz="4" w:space="0" w:color="auto"/>
               <w:left w:val="single" w:sz="4" w:space="0" w:color="auto"/>
@@ -1650,7 +957,7 @@
         </w:tc>
         <w:tc>
           <w:tcPr>
-            <w:tcW w:w="992" w:type="dxa"/>
+            <w:tcW w:w="567" w:type="dxa"/>
             <w:tcBorders>
               <w:top w:val="dotted" w:sz="4" w:space="0" w:color="auto"/>
               <w:left w:val="single" w:sz="4" w:space="0" w:color="auto"/>
@@ -1670,7 +977,7 @@
         </w:tc>
         <w:tc>
           <w:tcPr>
-            <w:tcW w:w="992" w:type="dxa"/>
+            <w:tcW w:w="566" w:type="dxa"/>
             <w:tcBorders>
               <w:top w:val="dotted" w:sz="4" w:space="0" w:color="auto"/>
               <w:left w:val="single" w:sz="4" w:space="0" w:color="auto"/>
@@ -1692,7 +999,7 @@
       <w:tr>
         <w:tc>
           <w:tcPr>
-            <w:tcW w:w="4678" w:type="dxa"/>
+            <w:tcW w:w="7797" w:type="dxa"/>
             <w:tcBorders>
               <w:top w:val="single" w:sz="4" w:space="0" w:color="auto"/>
               <w:bottom w:val="single" w:sz="4" w:space="0" w:color="auto"/>
@@ -1718,7 +1025,7 @@
         </w:tc>
         <w:tc>
           <w:tcPr>
-            <w:tcW w:w="1134" w:type="dxa"/>
+            <w:tcW w:w="567" w:type="dxa"/>
             <w:tcBorders>
               <w:top w:val="dotted" w:sz="4" w:space="0" w:color="auto"/>
               <w:left w:val="single" w:sz="4" w:space="0" w:color="auto"/>
@@ -1738,7 +1045,7 @@
         </w:tc>
         <w:tc>
           <w:tcPr>
-            <w:tcW w:w="1134" w:type="dxa"/>
+            <w:tcW w:w="567" w:type="dxa"/>
             <w:tcBorders>
               <w:top w:val="dotted" w:sz="4" w:space="0" w:color="auto"/>
               <w:left w:val="single" w:sz="4" w:space="0" w:color="auto"/>
@@ -1758,7 +1065,7 @@
         </w:tc>
         <w:tc>
           <w:tcPr>
-            <w:tcW w:w="992" w:type="dxa"/>
+            <w:tcW w:w="567" w:type="dxa"/>
             <w:tcBorders>
               <w:top w:val="dotted" w:sz="4" w:space="0" w:color="auto"/>
               <w:left w:val="single" w:sz="4" w:space="0" w:color="auto"/>
@@ -1778,7 +1085,7 @@
         </w:tc>
         <w:tc>
           <w:tcPr>
-            <w:tcW w:w="992" w:type="dxa"/>
+            <w:tcW w:w="567" w:type="dxa"/>
             <w:tcBorders>
               <w:top w:val="dotted" w:sz="4" w:space="0" w:color="auto"/>
               <w:left w:val="single" w:sz="4" w:space="0" w:color="auto"/>
@@ -1798,7 +1105,7 @@
         </w:tc>
         <w:tc>
           <w:tcPr>
-            <w:tcW w:w="992" w:type="dxa"/>
+            <w:tcW w:w="566" w:type="dxa"/>
             <w:tcBorders>
               <w:top w:val="dotted" w:sz="4" w:space="0" w:color="auto"/>
               <w:left w:val="single" w:sz="4" w:space="0" w:color="auto"/>
@@ -1820,7 +1127,7 @@
       <w:tr>
         <w:tc>
           <w:tcPr>
-            <w:tcW w:w="4678" w:type="dxa"/>
+            <w:tcW w:w="7797" w:type="dxa"/>
             <w:tcBorders>
               <w:top w:val="single" w:sz="4" w:space="0" w:color="auto"/>
               <w:bottom w:val="single" w:sz="4" w:space="0" w:color="auto"/>
@@ -1841,57 +1148,21 @@
                 <w:sz w:val="28"/>
                 <w:cs/>
               </w:rPr>
-              <w:t>6.สามารถวินิจฉัยผู้ป่วยที่มีภาวะ</w:t>
-            </w:r>
-            <w:proofErr w:type="spellStart"/>
-            <w:r>
-              <w:rPr>
-                <w:rFonts w:ascii="TH Sarabun New" w:hAnsi="TH Sarabun New" w:cs="TH Sarabun New"/>
-                <w:sz w:val="28"/>
-                <w:cs/>
-              </w:rPr>
-              <w:t>ช็อคป</w:t>
-            </w:r>
-            <w:proofErr w:type="spellEnd"/>
-            <w:r>
-              <w:rPr>
-                <w:rFonts w:ascii="TH Sarabun New" w:hAnsi="TH Sarabun New" w:cs="TH Sarabun New"/>
-                <w:sz w:val="28"/>
-                <w:cs/>
-              </w:rPr>
-              <w:t>ระเภทต่าง ๆ ทั้งที่เกิดจากภาวะพร่องสารน้ำและเลือด จากการทำงานของหัวใจล้มเหลว อุบัติเหตุ สัดส่วนจากการกระจายเลือด และการอุดตันของหลอดเลือดผิดปกติได้ อย่างถูกต้องรวดเร็วและเป็นระบบวินิจฉัย</w:t>
-            </w:r>
-            <w:r>
-              <w:rPr>
-                <w:rFonts w:ascii="TH Sarabun New" w:hAnsi="TH Sarabun New" w:cs="TH Sarabun New"/>
-                <w:sz w:val="28"/>
-                <w:cs/>
-              </w:rPr>
-              <w:t>ภาวะ</w:t>
-            </w:r>
-            <w:proofErr w:type="spellStart"/>
-            <w:r>
-              <w:rPr>
-                <w:rFonts w:ascii="TH Sarabun New" w:hAnsi="TH Sarabun New" w:cs="TH Sarabun New"/>
-                <w:sz w:val="28"/>
-                <w:cs/>
-              </w:rPr>
-              <w:t>ช็อ</w:t>
-            </w:r>
-            <w:proofErr w:type="spellEnd"/>
-            <w:r>
-              <w:rPr>
-                <w:rFonts w:ascii="TH Sarabun New" w:hAnsi="TH Sarabun New" w:cs="TH Sarabun New"/>
-                <w:sz w:val="28"/>
-                <w:cs/>
-              </w:rPr>
-              <w:t>คต่าง ๆ ได้ถูกต้องและรวดเร็วและประเมินเป็นระบบ</w:t>
-            </w:r>
-          </w:p>
-        </w:tc>
-        <w:tc>
-          <w:tcPr>
-            <w:tcW w:w="1134" w:type="dxa"/>
+              <w:t>6.สามารถวินิจฉัยผู้ป่วยที่มีภาวะช็อคประเภทต่าง ๆ ทั้งที่เกิดจากภาวะพร่องสารน้ำและเลือด จากการทำงานของหัวใจล้มเหลว อุบัติเหตุ สัดส่วนจากการกระจายเลือด และการอุดตันของหลอดเลือดผิดปกติได้ อย่างถูกต้องรวดเร็วและเป็นระบบวินิจฉัย</w:t>
+            </w:r>
+            <w:r>
+              <w:rPr>
+                <w:rFonts w:ascii="TH Sarabun New" w:hAnsi="TH Sarabun New" w:cs="TH Sarabun New"/>
+                <w:sz w:val="28"/>
+                <w:cs/>
+              </w:rPr>
+              <w:t>ภาวะช็อคต่าง ๆ ได้ถูกต้องและรวดเร็วและประเมินเป็นระบบ</w:t>
+            </w:r>
+          </w:p>
+        </w:tc>
+        <w:tc>
+          <w:tcPr>
+            <w:tcW w:w="567" w:type="dxa"/>
             <w:tcBorders>
               <w:top w:val="dotted" w:sz="4" w:space="0" w:color="auto"/>
               <w:left w:val="single" w:sz="4" w:space="0" w:color="auto"/>
@@ -1911,7 +1182,7 @@
         </w:tc>
         <w:tc>
           <w:tcPr>
-            <w:tcW w:w="1134" w:type="dxa"/>
+            <w:tcW w:w="567" w:type="dxa"/>
             <w:tcBorders>
               <w:top w:val="dotted" w:sz="4" w:space="0" w:color="auto"/>
               <w:left w:val="single" w:sz="4" w:space="0" w:color="auto"/>
@@ -1931,7 +1202,7 @@
         </w:tc>
         <w:tc>
           <w:tcPr>
-            <w:tcW w:w="992" w:type="dxa"/>
+            <w:tcW w:w="567" w:type="dxa"/>
             <w:tcBorders>
               <w:top w:val="dotted" w:sz="4" w:space="0" w:color="auto"/>
               <w:left w:val="single" w:sz="4" w:space="0" w:color="auto"/>
@@ -1951,7 +1222,7 @@
         </w:tc>
         <w:tc>
           <w:tcPr>
-            <w:tcW w:w="992" w:type="dxa"/>
+            <w:tcW w:w="567" w:type="dxa"/>
             <w:tcBorders>
               <w:top w:val="dotted" w:sz="4" w:space="0" w:color="auto"/>
               <w:left w:val="single" w:sz="4" w:space="0" w:color="auto"/>
@@ -1971,7 +1242,7 @@
         </w:tc>
         <w:tc>
           <w:tcPr>
-            <w:tcW w:w="992" w:type="dxa"/>
+            <w:tcW w:w="566" w:type="dxa"/>
             <w:tcBorders>
               <w:top w:val="dotted" w:sz="4" w:space="0" w:color="auto"/>
               <w:left w:val="single" w:sz="4" w:space="0" w:color="auto"/>
@@ -1992,12 +1263,420 @@
       </w:tr>
     </w:tbl>
     <w:p>
-      <w:bookmarkStart w:id="0" w:name="_GoBack"/>
-      <w:bookmarkEnd w:id="0"/>
+      <w:pPr>
+        <w:shd w:val="clear" w:color="auto" w:fill="FFFFFF"/>
+        <w:spacing w:after="0" w:line="240" w:lineRule="auto"/>
+        <w:rPr>
+          <w:rFonts w:ascii="TH SarabunPSK" w:eastAsia="Times New Roman" w:hAnsi="TH SarabunPSK" w:cs="TH SarabunPSK"/>
+          <w:color w:val="1F1F1F"/>
+          <w:szCs w:val="22"/>
+        </w:rPr>
+      </w:pPr>
     </w:p>
+    <w:tbl>
+      <w:tblPr>
+        <w:tblStyle w:val="a4"/>
+        <w:tblpPr w:leftFromText="180" w:rightFromText="180" w:vertAnchor="text" w:horzAnchor="page" w:tblpX="981" w:tblpY="80"/>
+        <w:tblW w:w="0" w:type="auto"/>
+        <w:tblLook w:val="04A0" w:firstRow="1" w:lastRow="0" w:firstColumn="1" w:lastColumn="0" w:noHBand="0" w:noVBand="1"/>
+      </w:tblPr>
+      <w:tblGrid>
+        <w:gridCol w:w="562"/>
+        <w:gridCol w:w="8080"/>
+      </w:tblGrid>
+      <w:tr>
+        <w:tc>
+          <w:tcPr>
+            <w:tcW w:w="8642" w:type="dxa"/>
+            <w:gridSpan w:val="2"/>
+          </w:tcPr>
+          <w:p>
+            <w:pPr>
+              <w:rPr>
+                <w:rFonts w:ascii="TH Sarabun New" w:hAnsi="TH Sarabun New" w:cs="TH Sarabun New"/>
+                <w:b/>
+                <w:bCs/>
+                <w:sz w:val="28"/>
+              </w:rPr>
+            </w:pPr>
+            <w:r>
+              <w:rPr>
+                <w:rFonts w:ascii="TH Sarabun New" w:hAnsi="TH Sarabun New" w:cs="TH Sarabun New"/>
+                <w:b/>
+                <w:bCs/>
+                <w:sz w:val="30"/>
+                <w:szCs w:val="30"/>
+              </w:rPr>
+              <w:t>Overall performance:</w:t>
+            </w:r>
+          </w:p>
+        </w:tc>
+      </w:tr>
+      <w:tr>
+        <w:tc>
+          <w:tcPr>
+            <w:tcW w:w="562" w:type="dxa"/>
+          </w:tcPr>
+          <w:p>
+            <w:pPr>
+              <w:rPr>
+                <w:rFonts w:ascii="TH SarabunPSK" w:eastAsia="Times New Roman" w:hAnsi="TH SarabunPSK" w:cs="TH SarabunPSK"/>
+                <w:color w:val="1F1F1F"/>
+                <w:szCs w:val="22"/>
+              </w:rPr>
+            </w:pPr>
+          </w:p>
+        </w:tc>
+        <w:tc>
+          <w:tcPr>
+            <w:tcW w:w="8080" w:type="dxa"/>
+          </w:tcPr>
+          <w:p>
+            <w:pPr>
+              <w:rPr>
+                <w:rFonts w:ascii="TH Sarabun New" w:hAnsi="TH Sarabun New" w:cs="TH Sarabun New"/>
+                <w:sz w:val="28"/>
+              </w:rPr>
+            </w:pPr>
+            <w:r>
+              <w:rPr>
+                <w:rFonts w:ascii="TH Sarabun New" w:hAnsi="TH Sarabun New" w:cs="TH Sarabun New"/>
+                <w:sz w:val="28"/>
+              </w:rPr>
+              <w:t>Excellence (</w:t>
+            </w:r>
+            <w:r>
+              <w:rPr>
+                <w:rFonts w:ascii="TH Sarabun New" w:hAnsi="TH Sarabun New" w:cs="TH Sarabun New"/>
+                <w:sz w:val="28"/>
+                <w:cs/>
+              </w:rPr>
+              <w:t xml:space="preserve">ผ่านเกณฑ์ระดับ </w:t>
+            </w:r>
+            <w:r>
+              <w:rPr>
+                <w:rFonts w:ascii="TH Sarabun New" w:hAnsi="TH Sarabun New" w:cs="TH Sarabun New"/>
+                <w:sz w:val="28"/>
+              </w:rPr>
+              <w:t xml:space="preserve">L4-5 </w:t>
+            </w:r>
+            <w:r>
+              <w:rPr>
+                <w:rFonts w:ascii="TH Sarabun New" w:hAnsi="TH Sarabun New" w:cs="TH Sarabun New"/>
+                <w:sz w:val="28"/>
+                <w:cs/>
+              </w:rPr>
+              <w:t xml:space="preserve">ทุกหัวข้อ พร้อมสอบ </w:t>
+            </w:r>
+            <w:r>
+              <w:rPr>
+                <w:rFonts w:ascii="TH Sarabun New" w:hAnsi="TH Sarabun New" w:cs="TH Sarabun New"/>
+                <w:sz w:val="28"/>
+              </w:rPr>
+              <w:t xml:space="preserve">oral examination </w:t>
+            </w:r>
+            <w:r>
+              <w:rPr>
+                <w:rFonts w:ascii="TH Sarabun New" w:hAnsi="TH Sarabun New" w:cs="TH Sarabun New"/>
+                <w:sz w:val="28"/>
+                <w:cs/>
+              </w:rPr>
+              <w:t>ในหัวข้อนั้น ๆ)</w:t>
+            </w:r>
+          </w:p>
+        </w:tc>
+      </w:tr>
+      <w:tr>
+        <w:tc>
+          <w:tcPr>
+            <w:tcW w:w="562" w:type="dxa"/>
+          </w:tcPr>
+          <w:p>
+            <w:pPr>
+              <w:rPr>
+                <w:rFonts w:ascii="TH SarabunPSK" w:eastAsia="Times New Roman" w:hAnsi="TH SarabunPSK" w:cs="TH SarabunPSK"/>
+                <w:color w:val="1F1F1F"/>
+                <w:szCs w:val="22"/>
+              </w:rPr>
+            </w:pPr>
+          </w:p>
+        </w:tc>
+        <w:tc>
+          <w:tcPr>
+            <w:tcW w:w="8080" w:type="dxa"/>
+          </w:tcPr>
+          <w:p>
+            <w:pPr>
+              <w:rPr>
+                <w:rFonts w:ascii="TH Sarabun New" w:hAnsi="TH Sarabun New" w:cs="TH Sarabun New"/>
+                <w:sz w:val="28"/>
+              </w:rPr>
+            </w:pPr>
+            <w:r>
+              <w:rPr>
+                <w:rFonts w:ascii="TH Sarabun New" w:hAnsi="TH Sarabun New" w:cs="TH Sarabun New"/>
+                <w:sz w:val="28"/>
+              </w:rPr>
+              <w:t>Pass (</w:t>
+            </w:r>
+            <w:r>
+              <w:rPr>
+                <w:rFonts w:ascii="TH Sarabun New" w:hAnsi="TH Sarabun New" w:cs="TH Sarabun New"/>
+                <w:sz w:val="28"/>
+                <w:cs/>
+              </w:rPr>
+              <w:t xml:space="preserve">ผ่านเกณฑ์ระดับ </w:t>
+            </w:r>
+            <w:r>
+              <w:rPr>
+                <w:rFonts w:ascii="TH Sarabun New" w:hAnsi="TH Sarabun New" w:cs="TH Sarabun New"/>
+                <w:sz w:val="28"/>
+              </w:rPr>
+              <w:t xml:space="preserve">L 2-3 </w:t>
+            </w:r>
+            <w:r>
+              <w:rPr>
+                <w:rFonts w:ascii="TH Sarabun New" w:hAnsi="TH Sarabun New" w:cs="TH Sarabun New"/>
+                <w:sz w:val="28"/>
+                <w:cs/>
+              </w:rPr>
+              <w:t xml:space="preserve">ทุกหัวข้อสำหรับ </w:t>
+            </w:r>
+            <w:r>
+              <w:rPr>
+                <w:rFonts w:ascii="TH Sarabun New" w:hAnsi="TH Sarabun New" w:cs="TH Sarabun New"/>
+                <w:sz w:val="28"/>
+              </w:rPr>
+              <w:t xml:space="preserve">resident </w:t>
+            </w:r>
+            <w:r>
+              <w:rPr>
+                <w:rFonts w:ascii="TH Sarabun New" w:hAnsi="TH Sarabun New" w:cs="TH Sarabun New"/>
+                <w:sz w:val="28"/>
+                <w:cs/>
+              </w:rPr>
+              <w:t xml:space="preserve">ชั้นปีที่ </w:t>
+            </w:r>
+            <w:r>
+              <w:rPr>
+                <w:rFonts w:ascii="TH Sarabun New" w:hAnsi="TH Sarabun New" w:cs="TH Sarabun New"/>
+                <w:sz w:val="28"/>
+              </w:rPr>
+              <w:t>1-2)</w:t>
+            </w:r>
+          </w:p>
+        </w:tc>
+      </w:tr>
+      <w:tr>
+        <w:tc>
+          <w:tcPr>
+            <w:tcW w:w="562" w:type="dxa"/>
+          </w:tcPr>
+          <w:p>
+            <w:pPr>
+              <w:rPr>
+                <w:rFonts w:ascii="TH SarabunPSK" w:eastAsia="Times New Roman" w:hAnsi="TH SarabunPSK" w:cs="TH SarabunPSK"/>
+                <w:color w:val="1F1F1F"/>
+                <w:szCs w:val="22"/>
+              </w:rPr>
+            </w:pPr>
+          </w:p>
+        </w:tc>
+        <w:tc>
+          <w:tcPr>
+            <w:tcW w:w="8080" w:type="dxa"/>
+          </w:tcPr>
+          <w:p>
+            <w:pPr>
+              <w:rPr>
+                <w:rFonts w:ascii="TH Sarabun New" w:hAnsi="TH Sarabun New" w:cs="TH Sarabun New"/>
+                <w:sz w:val="28"/>
+              </w:rPr>
+            </w:pPr>
+            <w:r>
+              <w:rPr>
+                <w:rFonts w:ascii="TH Sarabun New" w:hAnsi="TH Sarabun New" w:cs="TH Sarabun New"/>
+                <w:sz w:val="28"/>
+              </w:rPr>
+              <w:t>Boarderline (</w:t>
+            </w:r>
+            <w:r>
+              <w:rPr>
+                <w:rFonts w:ascii="TH Sarabun New" w:hAnsi="TH Sarabun New" w:cs="TH Sarabun New"/>
+                <w:sz w:val="28"/>
+                <w:cs/>
+              </w:rPr>
+              <w:t>ผ่านเกณ์บางหัวข้อ)</w:t>
+            </w:r>
+          </w:p>
+        </w:tc>
+      </w:tr>
+      <w:tr>
+        <w:tc>
+          <w:tcPr>
+            <w:tcW w:w="562" w:type="dxa"/>
+          </w:tcPr>
+          <w:p>
+            <w:pPr>
+              <w:rPr>
+                <w:rFonts w:ascii="TH SarabunPSK" w:eastAsia="Times New Roman" w:hAnsi="TH SarabunPSK" w:cs="TH SarabunPSK"/>
+                <w:color w:val="1F1F1F"/>
+                <w:szCs w:val="22"/>
+              </w:rPr>
+            </w:pPr>
+          </w:p>
+        </w:tc>
+        <w:tc>
+          <w:tcPr>
+            <w:tcW w:w="8080" w:type="dxa"/>
+          </w:tcPr>
+          <w:p>
+            <w:pPr>
+              <w:rPr>
+                <w:rFonts w:ascii="TH Sarabun New" w:hAnsi="TH Sarabun New" w:cs="TH Sarabun New"/>
+                <w:sz w:val="28"/>
+              </w:rPr>
+            </w:pPr>
+            <w:r>
+              <w:rPr>
+                <w:rFonts w:ascii="TH Sarabun New" w:hAnsi="TH Sarabun New" w:cs="TH Sarabun New"/>
+                <w:sz w:val="28"/>
+              </w:rPr>
+              <w:t>Fail (</w:t>
+            </w:r>
+            <w:r>
+              <w:rPr>
+                <w:rFonts w:ascii="TH Sarabun New" w:hAnsi="TH Sarabun New" w:cs="TH Sarabun New"/>
+                <w:sz w:val="28"/>
+                <w:cs/>
+              </w:rPr>
+              <w:t>ไม่ผ่านเกณฑ์</w:t>
+            </w:r>
+            <w:r>
+              <w:rPr>
+                <w:rFonts w:ascii="TH Sarabun New" w:hAnsi="TH Sarabun New" w:cs="TH Sarabun New"/>
+                <w:sz w:val="28"/>
+              </w:rPr>
+              <w:t xml:space="preserve">, Major error </w:t>
+            </w:r>
+            <w:r>
+              <w:rPr>
+                <w:rFonts w:ascii="TH Sarabun New" w:hAnsi="TH Sarabun New" w:cs="TH Sarabun New"/>
+                <w:sz w:val="28"/>
+                <w:cs/>
+              </w:rPr>
+              <w:t xml:space="preserve">รบกวนกรอกเหตุผลในช่อง </w:t>
+            </w:r>
+            <w:r>
+              <w:rPr>
+                <w:rFonts w:ascii="TH Sarabun New" w:hAnsi="TH Sarabun New" w:cs="TH Sarabun New"/>
+                <w:sz w:val="28"/>
+              </w:rPr>
+              <w:t>comment)</w:t>
+            </w:r>
+          </w:p>
+        </w:tc>
+      </w:tr>
+    </w:tbl>
+    <w:p>
+      <w:pPr>
+        <w:shd w:val="clear" w:color="auto" w:fill="FFFFFF"/>
+        <w:spacing w:after="0" w:line="240" w:lineRule="auto"/>
+        <w:rPr>
+          <w:rFonts w:ascii="TH SarabunPSK" w:eastAsia="Times New Roman" w:hAnsi="TH SarabunPSK" w:cs="TH SarabunPSK"/>
+          <w:color w:val="1F1F1F"/>
+          <w:szCs w:val="22"/>
+          <w:cs/>
+        </w:rPr>
+      </w:pPr>
+    </w:p>
+    <w:p>
+      <w:pPr>
+        <w:rPr>
+          <w:cs/>
+        </w:rPr>
+      </w:pPr>
+    </w:p>
+    <w:p>
+      <w:pPr>
+        <w:tabs>
+          <w:tab w:val="left" w:pos="7141"/>
+        </w:tabs>
+      </w:pPr>
+    </w:p>
+    <w:p>
+      <w:pPr>
+        <w:tabs>
+          <w:tab w:val="left" w:pos="7141"/>
+        </w:tabs>
+      </w:pPr>
+    </w:p>
+    <w:p>
+      <w:pPr>
+        <w:tabs>
+          <w:tab w:val="left" w:pos="7141"/>
+        </w:tabs>
+      </w:pPr>
+    </w:p>
+    <w:p>
+      <w:pPr>
+        <w:spacing w:after="0" w:line="240" w:lineRule="auto"/>
+        <w:rPr>
+          <w:rFonts w:ascii="TH Sarabun New" w:hAnsi="TH Sarabun New" w:cs="TH Sarabun New"/>
+          <w:b/>
+          <w:bCs/>
+          <w:sz w:val="30"/>
+          <w:szCs w:val="30"/>
+        </w:rPr>
+      </w:pPr>
+      <w:r>
+        <w:rPr>
+          <w:rFonts w:ascii="TH Sarabun New" w:hAnsi="TH Sarabun New" w:cs="TH Sarabun New"/>
+          <w:b/>
+          <w:bCs/>
+          <w:sz w:val="30"/>
+          <w:szCs w:val="30"/>
+        </w:rPr>
+        <w:t>Comment</w:t>
+      </w:r>
+      <w:proofErr w:type="gramStart"/>
+      <w:r>
+        <w:rPr>
+          <w:rFonts w:ascii="TH Sarabun New" w:hAnsi="TH Sarabun New" w:cs="TH Sarabun New" w:hint="cs"/>
+          <w:b/>
+          <w:bCs/>
+          <w:sz w:val="30"/>
+          <w:szCs w:val="30"/>
+          <w:cs/>
+        </w:rPr>
+        <w:t xml:space="preserve"> </w:t>
+      </w:r>
+      <w:r>
+        <w:rPr>
+          <w:rFonts w:ascii="TH Sarabun New" w:hAnsi="TH Sarabun New" w:cs="TH Sarabun New"/>
+          <w:b/>
+          <w:bCs/>
+          <w:sz w:val="30"/>
+          <w:szCs w:val="30"/>
+        </w:rPr>
+        <w:t>:…</w:t>
+      </w:r>
+      <w:proofErr w:type="gramEnd"/>
+      <w:r>
+        <w:rPr>
+          <w:rFonts w:ascii="TH Sarabun New" w:hAnsi="TH Sarabun New" w:cs="TH Sarabun New"/>
+          <w:b/>
+          <w:bCs/>
+          <w:sz w:val="30"/>
+          <w:szCs w:val="30"/>
+        </w:rPr>
+        <w:t>…………………………………</w:t>
+      </w:r>
+    </w:p>
+    <w:p/>
     <w:sectPr>
       <w:pgSz w:w="11906" w:h="16838"/>
-      <w:pgMar w:top="1440" w:right="1440" w:bottom="1440" w:left="1440" w:header="708" w:footer="708" w:gutter="0"/>
+      <w:pgMar w:top="993" w:right="1440" w:bottom="1440" w:left="1440" w:header="708" w:footer="708" w:gutter="0"/>
       <w:cols w:space="708"/>
       <w:docGrid w:linePitch="360"/>
     </w:sectPr>
@@ -2265,6 +1944,7 @@
     <w:lsdException w:name="HTML Sample" w:semiHidden="1" w:unhideWhenUsed="1"/>
     <w:lsdException w:name="HTML Typewriter" w:semiHidden="1" w:unhideWhenUsed="1"/>
     <w:lsdException w:name="HTML Variable" w:semiHidden="1" w:unhideWhenUsed="1"/>
+    <w:lsdException w:name="Normal Table" w:semiHidden="1" w:unhideWhenUsed="1"/>
     <w:lsdException w:name="annotation subject" w:semiHidden="1" w:unhideWhenUsed="1"/>
     <w:lsdException w:name="No List" w:semiHidden="1" w:unhideWhenUsed="1"/>
     <w:lsdException w:name="Outline List 1" w:semiHidden="1" w:unhideWhenUsed="1"/>
@@ -2308,8 +1988,10 @@
     <w:lsdException w:name="Table Elegant" w:semiHidden="1" w:unhideWhenUsed="1"/>
     <w:lsdException w:name="Table Professional" w:semiHidden="1" w:unhideWhenUsed="1"/>
     <w:lsdException w:name="Table Subtle 1" w:semiHidden="1" w:unhideWhenUsed="1"/>
+    <w:lsdException w:name="Table Subtle 2" w:semiHidden="1" w:unhideWhenUsed="1"/>
     <w:lsdException w:name="Table Web 1" w:semiHidden="1" w:unhideWhenUsed="1"/>
     <w:lsdException w:name="Table Web 2" w:semiHidden="1" w:unhideWhenUsed="1"/>
+    <w:lsdException w:name="Table Web 3" w:semiHidden="1" w:unhideWhenUsed="1"/>
     <w:lsdException w:name="Balloon Text" w:semiHidden="1" w:unhideWhenUsed="1"/>
     <w:lsdException w:name="Table Grid" w:uiPriority="39"/>
     <w:lsdException w:name="Table Theme" w:semiHidden="1" w:unhideWhenUsed="1"/>
@@ -2581,6 +2263,25 @@
       <w:lang w:eastAsia="ko-KR"/>
     </w:rPr>
   </w:style>
+  <w:style w:type="table" w:styleId="a4">
+    <w:name w:val="Table Grid"/>
+    <w:basedOn w:val="a1"/>
+    <w:uiPriority w:val="39"/>
+    <w:rsid w:val="009256DD"/>
+    <w:pPr>
+      <w:spacing w:after="0" w:line="240" w:lineRule="auto"/>
+    </w:pPr>
+    <w:tblPr>
+      <w:tblBorders>
+        <w:top w:val="single" w:sz="4" w:space="0" w:color="auto"/>
+        <w:left w:val="single" w:sz="4" w:space="0" w:color="auto"/>
+        <w:bottom w:val="single" w:sz="4" w:space="0" w:color="auto"/>
+        <w:right w:val="single" w:sz="4" w:space="0" w:color="auto"/>
+        <w:insideH w:val="single" w:sz="4" w:space="0" w:color="auto"/>
+        <w:insideV w:val="single" w:sz="4" w:space="0" w:color="auto"/>
+      </w:tblBorders>
+    </w:tblPr>
+  </w:style>
 </w:styles>
 </file>
 

</xml_diff>